<commit_message>
Add formal pmsampsize sample-size justification, fold into Results doc
- src/22_pmsampsize.py: standalone re-implementation of Riley et al. 2020
  binary-outcome criteria (shrinkage, R2 adjustment, intercept precision),
  since the official pmsampsize package requires Python >=3.12. Saves
  outputs/pmsampsize_results.xlsx (kept local, matches existing outputs/
  policy).
- Add Section 7 to Lupus_Project_Results.docx: all 3 flare cohorts are
  underpowered by pmsampsize despite meeting EPV-10; both ESRD cohorts are
  adequate. Regenerated the doc.
</commit_message>
<xml_diff>
--- a/outputs/Lupus_Project_Results.docx
+++ b/outputs/Lupus_Project_Results.docx
@@ -11298,6 +11298,635 @@
       </w:pPr>
       <w:r>
         <w:t>Across all four cohorts, TabPFN v3's main advantage is consistently calibration (Brier score), not discrimination (AUROC) — it matches but does not exceed the best-tuned model's AUROC in every case.</w:t>
+      </w:r>
+    </w:p>
+    <w:p>
+      <w:pPr>
+        <w:pStyle w:val="Heading1"/>
+        <w:spacing w:before="280" w:after="80"/>
+      </w:pPr>
+      <w:r>
+        <w:t>7. Sample Size Justification (pmsampsize)</w:t>
+      </w:r>
+    </w:p>
+    <w:p>
+      <w:pPr>
+        <w:spacing w:after="120"/>
+      </w:pPr>
+      <w:r>
+        <w:t>Formal minimum sample size was calculated per Riley et al. 2020 (BMJ 368:m441) for each cohort, using the final predictor count, observed event prevalence, and the cohort's own optimism-adjusted (bias-corrected) Logistic Regression AUROC as the anticipated C-statistic (LR is the paper's designated primary model). Required n = max of three criteria: (1) predictor-effect shrinkage &lt;=10%, (2) &lt;=0.05 absolute difference between apparent and adjusted Nagelkerke R2, (3) intercept estimated to within a 0.05 margin of error (src/22_pmsampsize.py).</w:t>
+      </w:r>
+    </w:p>
+    <w:tbl>
+      <w:tblPr>
+        <w:tblStyle w:val="TableGrid"/>
+        <w:tblW w:type="auto" w:w="0"/>
+        <w:jc w:val="center"/>
+        <w:tblLook w:firstColumn="1" w:firstRow="1" w:lastColumn="0" w:lastRow="0" w:noHBand="0" w:noVBand="1" w:val="04A0"/>
+      </w:tblPr>
+      <w:tblGrid>
+        <w:gridCol w:w="1295"/>
+        <w:gridCol w:w="1295"/>
+        <w:gridCol w:w="1295"/>
+        <w:gridCol w:w="1295"/>
+        <w:gridCol w:w="1295"/>
+        <w:gridCol w:w="1295"/>
+        <w:gridCol w:w="1295"/>
+      </w:tblGrid>
+      <w:tr>
+        <w:tc>
+          <w:tcPr>
+            <w:tcW w:type="dxa" w:w="2268"/>
+            <w:shd w:val="clear" w:color="auto" w:fill="BDD7EE"/>
+          </w:tcPr>
+          <w:p>
+            <w:r>
+              <w:rPr>
+                <w:b/>
+                <w:sz w:val="20"/>
+              </w:rPr>
+              <w:t>Cohort</w:t>
+            </w:r>
+          </w:p>
+        </w:tc>
+        <w:tc>
+          <w:tcPr>
+            <w:tcW w:type="dxa" w:w="850"/>
+            <w:shd w:val="clear" w:color="auto" w:fill="BDD7EE"/>
+          </w:tcPr>
+          <w:p>
+            <w:r>
+              <w:rPr>
+                <w:b/>
+                <w:sz w:val="20"/>
+              </w:rPr>
+              <w:t>p</w:t>
+            </w:r>
+          </w:p>
+        </w:tc>
+        <w:tc>
+          <w:tcPr>
+            <w:tcW w:type="dxa" w:w="1701"/>
+            <w:shd w:val="clear" w:color="auto" w:fill="BDD7EE"/>
+          </w:tcPr>
+          <w:p>
+            <w:r>
+              <w:rPr>
+                <w:b/>
+                <w:sz w:val="20"/>
+              </w:rPr>
+              <w:t>C-stat (LR, BC)</w:t>
+            </w:r>
+          </w:p>
+        </w:tc>
+        <w:tc>
+          <w:tcPr>
+            <w:tcW w:type="dxa" w:w="1417"/>
+            <w:shd w:val="clear" w:color="auto" w:fill="BDD7EE"/>
+          </w:tcPr>
+          <w:p>
+            <w:r>
+              <w:rPr>
+                <w:b/>
+                <w:sz w:val="20"/>
+              </w:rPr>
+              <w:t>n required</w:t>
+            </w:r>
+          </w:p>
+        </w:tc>
+        <w:tc>
+          <w:tcPr>
+            <w:tcW w:type="dxa" w:w="1417"/>
+            <w:shd w:val="clear" w:color="auto" w:fill="BDD7EE"/>
+          </w:tcPr>
+          <w:p>
+            <w:r>
+              <w:rPr>
+                <w:b/>
+                <w:sz w:val="20"/>
+              </w:rPr>
+              <w:t>n actual</w:t>
+            </w:r>
+          </w:p>
+        </w:tc>
+        <w:tc>
+          <w:tcPr>
+            <w:tcW w:type="dxa" w:w="1417"/>
+            <w:shd w:val="clear" w:color="auto" w:fill="BDD7EE"/>
+          </w:tcPr>
+          <w:p>
+            <w:r>
+              <w:rPr>
+                <w:b/>
+                <w:sz w:val="20"/>
+              </w:rPr>
+              <w:t>EPV actual</w:t>
+            </w:r>
+          </w:p>
+        </w:tc>
+        <w:tc>
+          <w:tcPr>
+            <w:tcW w:type="dxa" w:w="1417"/>
+            <w:shd w:val="clear" w:color="auto" w:fill="BDD7EE"/>
+          </w:tcPr>
+          <w:p>
+            <w:r>
+              <w:rPr>
+                <w:b/>
+                <w:sz w:val="20"/>
+              </w:rPr>
+              <w:t>Adequate?</w:t>
+            </w:r>
+          </w:p>
+        </w:tc>
+      </w:tr>
+      <w:tr>
+        <w:tc>
+          <w:tcPr>
+            <w:tcW w:type="dxa" w:w="2268"/>
+          </w:tcPr>
+          <w:p>
+            <w:r>
+              <w:rPr>
+                <w:sz w:val="20"/>
+              </w:rPr>
+              <w:t>1-Year flare</w:t>
+            </w:r>
+          </w:p>
+        </w:tc>
+        <w:tc>
+          <w:tcPr>
+            <w:tcW w:type="dxa" w:w="850"/>
+          </w:tcPr>
+          <w:p>
+            <w:r>
+              <w:rPr>
+                <w:sz w:val="20"/>
+              </w:rPr>
+              <w:t>9</w:t>
+            </w:r>
+          </w:p>
+        </w:tc>
+        <w:tc>
+          <w:tcPr>
+            <w:tcW w:type="dxa" w:w="1701"/>
+          </w:tcPr>
+          <w:p>
+            <w:r>
+              <w:rPr>
+                <w:sz w:val="20"/>
+              </w:rPr>
+              <w:t>0.709</w:t>
+            </w:r>
+          </w:p>
+        </w:tc>
+        <w:tc>
+          <w:tcPr>
+            <w:tcW w:type="dxa" w:w="1417"/>
+          </w:tcPr>
+          <w:p>
+            <w:r>
+              <w:rPr>
+                <w:sz w:val="20"/>
+              </w:rPr>
+              <w:t>795</w:t>
+            </w:r>
+          </w:p>
+        </w:tc>
+        <w:tc>
+          <w:tcPr>
+            <w:tcW w:type="dxa" w:w="1417"/>
+          </w:tcPr>
+          <w:p>
+            <w:r>
+              <w:rPr>
+                <w:sz w:val="20"/>
+              </w:rPr>
+              <w:t>430</w:t>
+            </w:r>
+          </w:p>
+        </w:tc>
+        <w:tc>
+          <w:tcPr>
+            <w:tcW w:type="dxa" w:w="1417"/>
+          </w:tcPr>
+          <w:p>
+            <w:r>
+              <w:rPr>
+                <w:sz w:val="20"/>
+              </w:rPr>
+              <w:t>11.00</w:t>
+            </w:r>
+          </w:p>
+        </w:tc>
+        <w:tc>
+          <w:tcPr>
+            <w:tcW w:type="dxa" w:w="1417"/>
+          </w:tcPr>
+          <w:p>
+            <w:r>
+              <w:rPr>
+                <w:sz w:val="20"/>
+              </w:rPr>
+              <w:t>No</w:t>
+            </w:r>
+          </w:p>
+        </w:tc>
+      </w:tr>
+      <w:tr>
+        <w:tc>
+          <w:tcPr>
+            <w:tcW w:type="dxa" w:w="2268"/>
+            <w:shd w:val="clear" w:color="auto" w:fill="F2F2F2"/>
+          </w:tcPr>
+          <w:p>
+            <w:r>
+              <w:rPr>
+                <w:sz w:val="20"/>
+              </w:rPr>
+              <w:t>5-Year flare</w:t>
+            </w:r>
+          </w:p>
+        </w:tc>
+        <w:tc>
+          <w:tcPr>
+            <w:tcW w:type="dxa" w:w="850"/>
+            <w:shd w:val="clear" w:color="auto" w:fill="F2F2F2"/>
+          </w:tcPr>
+          <w:p>
+            <w:r>
+              <w:rPr>
+                <w:sz w:val="20"/>
+              </w:rPr>
+              <w:t>10</w:t>
+            </w:r>
+          </w:p>
+        </w:tc>
+        <w:tc>
+          <w:tcPr>
+            <w:tcW w:type="dxa" w:w="1701"/>
+            <w:shd w:val="clear" w:color="auto" w:fill="F2F2F2"/>
+          </w:tcPr>
+          <w:p>
+            <w:r>
+              <w:rPr>
+                <w:sz w:val="20"/>
+              </w:rPr>
+              <w:t>0.670</w:t>
+            </w:r>
+          </w:p>
+        </w:tc>
+        <w:tc>
+          <w:tcPr>
+            <w:tcW w:type="dxa" w:w="1417"/>
+            <w:shd w:val="clear" w:color="auto" w:fill="F2F2F2"/>
+          </w:tcPr>
+          <w:p>
+            <w:r>
+              <w:rPr>
+                <w:sz w:val="20"/>
+              </w:rPr>
+              <w:t>976</w:t>
+            </w:r>
+          </w:p>
+        </w:tc>
+        <w:tc>
+          <w:tcPr>
+            <w:tcW w:type="dxa" w:w="1417"/>
+            <w:shd w:val="clear" w:color="auto" w:fill="F2F2F2"/>
+          </w:tcPr>
+          <w:p>
+            <w:r>
+              <w:rPr>
+                <w:sz w:val="20"/>
+              </w:rPr>
+              <w:t>356</w:t>
+            </w:r>
+          </w:p>
+        </w:tc>
+        <w:tc>
+          <w:tcPr>
+            <w:tcW w:type="dxa" w:w="1417"/>
+            <w:shd w:val="clear" w:color="auto" w:fill="F2F2F2"/>
+          </w:tcPr>
+          <w:p>
+            <w:r>
+              <w:rPr>
+                <w:sz w:val="20"/>
+              </w:rPr>
+              <w:t>16.60</w:t>
+            </w:r>
+          </w:p>
+        </w:tc>
+        <w:tc>
+          <w:tcPr>
+            <w:tcW w:type="dxa" w:w="1417"/>
+            <w:shd w:val="clear" w:color="auto" w:fill="F2F2F2"/>
+          </w:tcPr>
+          <w:p>
+            <w:r>
+              <w:rPr>
+                <w:sz w:val="20"/>
+              </w:rPr>
+              <w:t>No</w:t>
+            </w:r>
+          </w:p>
+        </w:tc>
+      </w:tr>
+      <w:tr>
+        <w:tc>
+          <w:tcPr>
+            <w:tcW w:type="dxa" w:w="2268"/>
+          </w:tcPr>
+          <w:p>
+            <w:r>
+              <w:rPr>
+                <w:sz w:val="20"/>
+              </w:rPr>
+              <w:t>Serial biopsy</w:t>
+            </w:r>
+          </w:p>
+        </w:tc>
+        <w:tc>
+          <w:tcPr>
+            <w:tcW w:type="dxa" w:w="850"/>
+          </w:tcPr>
+          <w:p>
+            <w:r>
+              <w:rPr>
+                <w:sz w:val="20"/>
+              </w:rPr>
+              <w:t>2</w:t>
+            </w:r>
+          </w:p>
+        </w:tc>
+        <w:tc>
+          <w:tcPr>
+            <w:tcW w:type="dxa" w:w="1701"/>
+          </w:tcPr>
+          <w:p>
+            <w:r>
+              <w:rPr>
+                <w:sz w:val="20"/>
+              </w:rPr>
+              <w:t>0.660</w:t>
+            </w:r>
+          </w:p>
+        </w:tc>
+        <w:tc>
+          <w:tcPr>
+            <w:tcW w:type="dxa" w:w="1417"/>
+          </w:tcPr>
+          <w:p>
+            <w:r>
+              <w:rPr>
+                <w:sz w:val="20"/>
+              </w:rPr>
+              <w:t>384</w:t>
+            </w:r>
+          </w:p>
+        </w:tc>
+        <w:tc>
+          <w:tcPr>
+            <w:tcW w:type="dxa" w:w="1417"/>
+          </w:tcPr>
+          <w:p>
+            <w:r>
+              <w:rPr>
+                <w:sz w:val="20"/>
+              </w:rPr>
+              <w:t>70</w:t>
+            </w:r>
+          </w:p>
+        </w:tc>
+        <w:tc>
+          <w:tcPr>
+            <w:tcW w:type="dxa" w:w="1417"/>
+          </w:tcPr>
+          <w:p>
+            <w:r>
+              <w:rPr>
+                <w:sz w:val="20"/>
+              </w:rPr>
+              <w:t>17.00</w:t>
+            </w:r>
+          </w:p>
+        </w:tc>
+        <w:tc>
+          <w:tcPr>
+            <w:tcW w:type="dxa" w:w="1417"/>
+          </w:tcPr>
+          <w:p>
+            <w:r>
+              <w:rPr>
+                <w:sz w:val="20"/>
+              </w:rPr>
+              <w:t>No</w:t>
+            </w:r>
+          </w:p>
+        </w:tc>
+      </w:tr>
+      <w:tr>
+        <w:tc>
+          <w:tcPr>
+            <w:tcW w:type="dxa" w:w="2268"/>
+            <w:shd w:val="clear" w:color="auto" w:fill="F2F2F2"/>
+          </w:tcPr>
+          <w:p>
+            <w:r>
+              <w:rPr>
+                <w:sz w:val="20"/>
+              </w:rPr>
+              <w:t>ESRD 5-Year</w:t>
+            </w:r>
+          </w:p>
+        </w:tc>
+        <w:tc>
+          <w:tcPr>
+            <w:tcW w:type="dxa" w:w="850"/>
+            <w:shd w:val="clear" w:color="auto" w:fill="F2F2F2"/>
+          </w:tcPr>
+          <w:p>
+            <w:r>
+              <w:rPr>
+                <w:sz w:val="20"/>
+              </w:rPr>
+              <w:t>5</w:t>
+            </w:r>
+          </w:p>
+        </w:tc>
+        <w:tc>
+          <w:tcPr>
+            <w:tcW w:type="dxa" w:w="1701"/>
+            <w:shd w:val="clear" w:color="auto" w:fill="F2F2F2"/>
+          </w:tcPr>
+          <w:p>
+            <w:r>
+              <w:rPr>
+                <w:sz w:val="20"/>
+              </w:rPr>
+              <w:t>0.797</w:t>
+            </w:r>
+          </w:p>
+        </w:tc>
+        <w:tc>
+          <w:tcPr>
+            <w:tcW w:type="dxa" w:w="1417"/>
+            <w:shd w:val="clear" w:color="auto" w:fill="F2F2F2"/>
+          </w:tcPr>
+          <w:p>
+            <w:r>
+              <w:rPr>
+                <w:sz w:val="20"/>
+              </w:rPr>
+              <w:t>294</w:t>
+            </w:r>
+          </w:p>
+        </w:tc>
+        <w:tc>
+          <w:tcPr>
+            <w:tcW w:type="dxa" w:w="1417"/>
+            <w:shd w:val="clear" w:color="auto" w:fill="F2F2F2"/>
+          </w:tcPr>
+          <w:p>
+            <w:r>
+              <w:rPr>
+                <w:sz w:val="20"/>
+              </w:rPr>
+              <w:t>796</w:t>
+            </w:r>
+          </w:p>
+        </w:tc>
+        <w:tc>
+          <w:tcPr>
+            <w:tcW w:type="dxa" w:w="1417"/>
+            <w:shd w:val="clear" w:color="auto" w:fill="F2F2F2"/>
+          </w:tcPr>
+          <w:p>
+            <w:r>
+              <w:rPr>
+                <w:sz w:val="20"/>
+              </w:rPr>
+              <w:t>22.40</w:t>
+            </w:r>
+          </w:p>
+        </w:tc>
+        <w:tc>
+          <w:tcPr>
+            <w:tcW w:type="dxa" w:w="1417"/>
+            <w:shd w:val="clear" w:color="auto" w:fill="F2F2F2"/>
+          </w:tcPr>
+          <w:p>
+            <w:r>
+              <w:rPr>
+                <w:sz w:val="20"/>
+              </w:rPr>
+              <w:t>Yes</w:t>
+            </w:r>
+          </w:p>
+        </w:tc>
+      </w:tr>
+      <w:tr>
+        <w:tc>
+          <w:tcPr>
+            <w:tcW w:type="dxa" w:w="2268"/>
+          </w:tcPr>
+          <w:p>
+            <w:r>
+              <w:rPr>
+                <w:sz w:val="20"/>
+              </w:rPr>
+              <w:t>ESRD 10-Year</w:t>
+            </w:r>
+          </w:p>
+        </w:tc>
+        <w:tc>
+          <w:tcPr>
+            <w:tcW w:type="dxa" w:w="850"/>
+          </w:tcPr>
+          <w:p>
+            <w:r>
+              <w:rPr>
+                <w:sz w:val="20"/>
+              </w:rPr>
+              <w:t>17</w:t>
+            </w:r>
+          </w:p>
+        </w:tc>
+        <w:tc>
+          <w:tcPr>
+            <w:tcW w:type="dxa" w:w="1701"/>
+          </w:tcPr>
+          <w:p>
+            <w:r>
+              <w:rPr>
+                <w:sz w:val="20"/>
+              </w:rPr>
+              <w:t>0.817</w:t>
+            </w:r>
+          </w:p>
+        </w:tc>
+        <w:tc>
+          <w:tcPr>
+            <w:tcW w:type="dxa" w:w="1417"/>
+          </w:tcPr>
+          <w:p>
+            <w:r>
+              <w:rPr>
+                <w:sz w:val="20"/>
+              </w:rPr>
+              <w:t>620</w:t>
+            </w:r>
+          </w:p>
+        </w:tc>
+        <w:tc>
+          <w:tcPr>
+            <w:tcW w:type="dxa" w:w="1417"/>
+          </w:tcPr>
+          <w:p>
+            <w:r>
+              <w:rPr>
+                <w:sz w:val="20"/>
+              </w:rPr>
+              <w:t>796</w:t>
+            </w:r>
+          </w:p>
+        </w:tc>
+        <w:tc>
+          <w:tcPr>
+            <w:tcW w:type="dxa" w:w="1417"/>
+          </w:tcPr>
+          <w:p>
+            <w:r>
+              <w:rPr>
+                <w:sz w:val="20"/>
+              </w:rPr>
+              <w:t>10.29</w:t>
+            </w:r>
+          </w:p>
+        </w:tc>
+        <w:tc>
+          <w:tcPr>
+            <w:tcW w:type="dxa" w:w="1417"/>
+          </w:tcPr>
+          <w:p>
+            <w:r>
+              <w:rPr>
+                <w:sz w:val="20"/>
+              </w:rPr>
+              <w:t>Yes</w:t>
+            </w:r>
+          </w:p>
+        </w:tc>
+      </w:tr>
+    </w:tbl>
+    <w:p/>
+    <w:p>
+      <w:pPr>
+        <w:spacing w:after="120"/>
+      </w:pPr>
+      <w:r>
+        <w:t>EPV-10 and Riley's formal criteria disagree for the three flare cohorts: all three are underpowered by pmsampsize despite meeting or exceeding EPV-10 (1-year EPV=11.00, 5-year EPV=16.60, serial EPV=17.00), because their lower discrimination (C-statistic 0.660-0.709) requires substantially more events to control overfitting and estimate the intercept precisely. Both ESRD cohorts are formally adequate — ESRD 10-year passes despite an EPV of only 10.29, since its higher discrimination (C=0.817) needs proportionally fewer events. This indicates the true sample-size shortfall in the flare cohorts is real and larger than the EPV-10 heuristic alone suggests, while the ESRD analyses are adequately powered by both criteria.</w:t>
       </w:r>
     </w:p>
     <w:sectPr>

</xml_diff>